<commit_message>
letterhead: site colors, prominent logo, watermark, empty writing area; Word refresh
Made-with: Cursor
</commit_message>
<xml_diff>
--- a/thiqqah-site/letterhead-thiqqah-new.docx
+++ b/thiqqah-site/letterhead-thiqqah-new.docx
@@ -4,268 +4,126 @@
   <w:body>
     <w:p>
       <w:pPr>
-        <w:spacing w:after="200"/>
-        <w:jc w:val="center"/>
-        <w:bidi w:val="1"/>
-      </w:pPr>
-      <w:r>
-        <w:rPr>
-          <w:rFonts w:ascii="Arial" w:hAnsi="Arial"/>
-          <w:color w:val="5A6578"/>
-          <w:sz w:val="18"/>
-        </w:rPr>
-        <w:t>جدة — منطقة مكة المكرمة — المملكة العربية السعودية</w:t>
-      </w:r>
-    </w:p>
-    <w:tbl>
-      <w:tblPr>
-        <w:tblW w:type="auto" w:w="0"/>
-        <w:jc w:val="center"/>
-        <w:tblLook w:firstColumn="1" w:firstRow="1" w:lastColumn="0" w:lastRow="0" w:noHBand="0" w:noVBand="1" w:val="04A0"/>
-      </w:tblPr>
-      <w:tblGrid>
-        <w:gridCol w:w="3203"/>
-        <w:gridCol w:w="3203"/>
-        <w:gridCol w:w="3203"/>
-      </w:tblGrid>
-      <w:tr>
-        <w:tc>
-          <w:tcPr>
-            <w:tcW w:type="dxa" w:w="3213"/>
-            <w:vAlign w:val="top"/>
-          </w:tcPr>
-          <w:p>
-            <w:pPr>
-              <w:spacing w:after="60"/>
-              <w:jc w:val="right"/>
-              <w:bidi w:val="1"/>
-            </w:pPr>
-            <w:r>
-              <w:rPr>
-                <w:rFonts w:ascii="Arial" w:hAnsi="Arial"/>
-                <w:b/>
-                <w:sz w:val="19"/>
-              </w:rPr>
-              <w:t xml:space="preserve">التاريخ: </w:t>
-            </w:r>
-            <w:r>
-              <w:rPr>
-                <w:rFonts w:ascii="Arial" w:hAnsi="Arial"/>
-                <w:color w:val="666666"/>
-                <w:sz w:val="19"/>
-              </w:rPr>
-              <w:t xml:space="preserve">    /    /    هـ</w:t>
-            </w:r>
-          </w:p>
-        </w:tc>
-        <w:tc>
-          <w:tcPr>
-            <w:tcW w:type="dxa" w:w="3213"/>
-            <w:vAlign w:val="top"/>
-          </w:tcPr>
-          <w:p>
-            <w:pPr>
-              <w:spacing w:after="60"/>
-              <w:jc w:val="right"/>
-              <w:bidi w:val="1"/>
-            </w:pPr>
-            <w:r>
-              <w:rPr>
-                <w:rFonts w:ascii="Arial" w:hAnsi="Arial"/>
-                <w:b/>
-                <w:sz w:val="19"/>
-              </w:rPr>
-              <w:t xml:space="preserve">المرجع: </w:t>
-            </w:r>
-            <w:r>
-              <w:rPr>
-                <w:rFonts w:ascii="Arial" w:hAnsi="Arial"/>
-                <w:color w:val="666666"/>
-                <w:sz w:val="19"/>
-              </w:rPr>
-              <w:t>_______________</w:t>
-            </w:r>
-          </w:p>
-        </w:tc>
-        <w:tc>
-          <w:tcPr>
-            <w:tcW w:type="dxa" w:w="3213"/>
-            <w:vAlign w:val="top"/>
-          </w:tcPr>
-          <w:p>
-            <w:pPr>
-              <w:spacing w:after="60"/>
-              <w:jc w:val="right"/>
-              <w:bidi w:val="1"/>
-            </w:pPr>
-            <w:r>
-              <w:rPr>
-                <w:rFonts w:ascii="Arial" w:hAnsi="Arial"/>
-                <w:b/>
-                <w:sz w:val="19"/>
-              </w:rPr>
-              <w:t xml:space="preserve">الموضوع: </w:t>
-            </w:r>
-            <w:r>
-              <w:rPr>
-                <w:rFonts w:ascii="Arial" w:hAnsi="Arial"/>
-                <w:color w:val="666666"/>
-                <w:sz w:val="19"/>
-              </w:rPr>
-              <w:t>_______________</w:t>
-            </w:r>
-          </w:p>
-        </w:tc>
-      </w:tr>
-    </w:tbl>
-    <w:p>
-      <w:pPr>
-        <w:spacing w:after="160"/>
+        <w:spacing w:after="220" w:line="280" w:lineRule="exact"/>
       </w:pPr>
     </w:p>
     <w:p>
       <w:pPr>
-        <w:spacing w:after="60"/>
-        <w:jc w:val="right"/>
-        <w:bidi w:val="1"/>
-      </w:pPr>
-      <w:r>
-        <w:rPr>
-          <w:rFonts w:ascii="Arial" w:hAnsi="Arial"/>
-          <w:b/>
-          <w:sz w:val="24"/>
-        </w:rPr>
-        <w:t>السادة / المحترمون،</w:t>
-      </w:r>
-    </w:p>
-    <w:p>
-      <w:pPr>
-        <w:spacing w:after="60" w:before="120"/>
-        <w:jc w:val="right"/>
-        <w:bidi w:val="1"/>
-      </w:pPr>
-      <w:r>
-        <w:rPr>
-          <w:rFonts w:ascii="Arial" w:hAnsi="Arial"/>
-          <w:i/>
-          <w:color w:val="999999"/>
-          <w:sz w:val="21"/>
-        </w:rPr>
-        <w:t>(اكتب نص الخطاب أو العقد هنا.)</w:t>
-      </w:r>
-    </w:p>
-    <w:p>
-      <w:pPr>
-        <w:spacing w:after="180"/>
-        <w:jc w:val="right"/>
-        <w:bidi w:val="1"/>
+        <w:spacing w:after="220" w:line="280" w:lineRule="exact"/>
       </w:pPr>
     </w:p>
     <w:p>
       <w:pPr>
-        <w:spacing w:after="180"/>
-        <w:jc w:val="right"/>
-        <w:bidi w:val="1"/>
+        <w:spacing w:after="220" w:line="280" w:lineRule="exact"/>
       </w:pPr>
     </w:p>
     <w:p>
       <w:pPr>
-        <w:spacing w:after="180"/>
-        <w:jc w:val="right"/>
-        <w:bidi w:val="1"/>
+        <w:spacing w:after="220" w:line="280" w:lineRule="exact"/>
       </w:pPr>
     </w:p>
     <w:p>
       <w:pPr>
-        <w:spacing w:after="180"/>
-        <w:jc w:val="right"/>
-        <w:bidi w:val="1"/>
+        <w:spacing w:after="220" w:line="280" w:lineRule="exact"/>
       </w:pPr>
     </w:p>
     <w:p>
       <w:pPr>
-        <w:spacing w:after="180"/>
-        <w:jc w:val="right"/>
-        <w:bidi w:val="1"/>
+        <w:spacing w:after="220" w:line="280" w:lineRule="exact"/>
       </w:pPr>
     </w:p>
     <w:p>
       <w:pPr>
-        <w:spacing w:after="180"/>
-        <w:jc w:val="right"/>
-        <w:bidi w:val="1"/>
+        <w:spacing w:after="220" w:line="280" w:lineRule="exact"/>
       </w:pPr>
     </w:p>
     <w:p>
       <w:pPr>
-        <w:spacing w:after="180"/>
-        <w:jc w:val="right"/>
-        <w:bidi w:val="1"/>
+        <w:spacing w:after="220" w:line="280" w:lineRule="exact"/>
       </w:pPr>
     </w:p>
     <w:p>
       <w:pPr>
-        <w:spacing w:after="180"/>
-        <w:jc w:val="right"/>
-        <w:bidi w:val="1"/>
+        <w:spacing w:after="220" w:line="280" w:lineRule="exact"/>
       </w:pPr>
     </w:p>
     <w:p>
       <w:pPr>
-        <w:spacing w:after="180"/>
-        <w:jc w:val="right"/>
-        <w:bidi w:val="1"/>
+        <w:spacing w:after="220" w:line="280" w:lineRule="exact"/>
       </w:pPr>
     </w:p>
     <w:p>
       <w:pPr>
-        <w:spacing w:after="180"/>
-        <w:jc w:val="right"/>
-        <w:bidi w:val="1"/>
+        <w:spacing w:after="220" w:line="280" w:lineRule="exact"/>
       </w:pPr>
     </w:p>
     <w:p>
       <w:pPr>
-        <w:spacing w:after="60"/>
-        <w:jc w:val="right"/>
-        <w:bidi w:val="1"/>
+        <w:spacing w:after="220" w:line="280" w:lineRule="exact"/>
       </w:pPr>
-      <w:r>
-        <w:rPr>
-          <w:rFonts w:ascii="Arial" w:hAnsi="Arial"/>
-          <w:sz w:val="22"/>
-        </w:rPr>
-        <w:t>وتفضلوا بقبول فائق الاحترام والتقدير،</w:t>
-      </w:r>
     </w:p>
     <w:p>
       <w:pPr>
-        <w:spacing w:after="60" w:before="400"/>
-        <w:jc w:val="right"/>
-        <w:bidi w:val="1"/>
+        <w:spacing w:after="220" w:line="280" w:lineRule="exact"/>
       </w:pPr>
-      <w:r>
-        <w:rPr>
-          <w:rFonts w:ascii="Arial" w:hAnsi="Arial"/>
-          <w:sz w:val="20"/>
-        </w:rPr>
-        <w:t>________________________</w:t>
-        <w:br/>
-        <w:t>الاسم — المسمى الوظيفي</w:t>
-      </w:r>
+    </w:p>
+    <w:p>
+      <w:pPr>
+        <w:spacing w:after="220" w:line="280" w:lineRule="exact"/>
+      </w:pPr>
+    </w:p>
+    <w:p>
+      <w:pPr>
+        <w:spacing w:after="220" w:line="280" w:lineRule="exact"/>
+      </w:pPr>
+    </w:p>
+    <w:p>
+      <w:pPr>
+        <w:spacing w:after="220" w:line="280" w:lineRule="exact"/>
+      </w:pPr>
+    </w:p>
+    <w:p>
+      <w:pPr>
+        <w:spacing w:after="220" w:line="280" w:lineRule="exact"/>
+      </w:pPr>
+    </w:p>
+    <w:p>
+      <w:pPr>
+        <w:spacing w:after="220" w:line="280" w:lineRule="exact"/>
+      </w:pPr>
+    </w:p>
+    <w:p>
+      <w:pPr>
+        <w:spacing w:after="220" w:line="280" w:lineRule="exact"/>
+      </w:pPr>
+    </w:p>
+    <w:p>
+      <w:pPr>
+        <w:spacing w:after="220" w:line="280" w:lineRule="exact"/>
+      </w:pPr>
+    </w:p>
+    <w:p>
+      <w:pPr>
+        <w:spacing w:after="220" w:line="280" w:lineRule="exact"/>
+      </w:pPr>
+    </w:p>
+    <w:p>
+      <w:pPr>
+        <w:spacing w:after="220" w:line="280" w:lineRule="exact"/>
+      </w:pPr>
     </w:p>
     <w:sectPr>
       <w:headerReference w:type="default" r:id="rId9"/>
       <w:footerReference w:type="default" r:id="rId10"/>
       <w:pgSz w:w="11906" w:h="16838"/>
-      <w:pgMar w:top="1247" w:right="1134" w:bottom="1928" w:left="1134" w:header="454" w:footer="510" w:gutter="0"/>
+      <w:pgMar w:top="1134" w:right="1134" w:bottom="1984" w:left="1134" w:header="425" w:footer="482" w:gutter="0"/>
       <w:cols w:space="720"/>
       <w:docGrid w:linePitch="360"/>
       <w:pgBorders>
-        <w:top w:val="double" w:sz="12" w:space="10" w:color="A67C2C"/>
-        <w:left w:val="double" w:sz="12" w:space="10" w:color="A67C2C"/>
-        <w:bottom w:val="double" w:sz="12" w:space="10" w:color="A67C2C"/>
-        <w:right w:val="double" w:sz="12" w:space="10" w:color="A67C2C"/>
+        <w:top w:val="double" w:sz="14" w:space="8" w:color="073F3A"/>
+        <w:left w:val="double" w:sz="14" w:space="8" w:color="073F3A"/>
+        <w:bottom w:val="double" w:sz="14" w:space="8" w:color="073F3A"/>
+        <w:right w:val="double" w:sz="14" w:space="8" w:color="073F3A"/>
       </w:pgBorders>
     </w:sectPr>
   </w:body>
@@ -282,12 +140,11 @@
   <w:tbl>
     <w:tblPr>
       <w:tblW w:type="auto" w:w="0"/>
-      <w:tblLayout w:type="fixed"/>
       <w:tblLook w:firstColumn="1" w:firstRow="1" w:lastColumn="0" w:lastRow="0" w:noHBand="0" w:noVBand="1" w:val="04A0"/>
     </w:tblPr>
     <w:tblGrid>
-      <w:gridCol w:w="1701"/>
-      <w:gridCol w:w="7937"/>
+      <w:gridCol w:w="1814"/>
+      <w:gridCol w:w="7824"/>
     </w:tblGrid>
     <w:tr>
       <w:tc>
@@ -303,7 +160,7 @@
           <w:r>
             <w:drawing>
               <wp:inline xmlns:a="http://schemas.openxmlformats.org/drawingml/2006/main" xmlns:pic="http://schemas.openxmlformats.org/drawingml/2006/picture">
-                <wp:extent cx="846000" cy="846000"/>
+                <wp:extent cx="864000" cy="864000"/>
                 <wp:docPr id="1" name="Picture 1"/>
                 <wp:cNvGraphicFramePr>
                   <a:graphicFrameLocks noChangeAspect="1"/>
@@ -324,7 +181,7 @@
                       <pic:spPr>
                         <a:xfrm>
                           <a:off x="0" y="0"/>
-                          <a:ext cx="846000" cy="846000"/>
+                          <a:ext cx="864000" cy="864000"/>
                         </a:xfrm>
                         <a:prstGeom prst="rect"/>
                       </pic:spPr>
@@ -342,11 +199,9 @@
           <w:r>
             <w:rPr>
               <w:rFonts w:ascii="Arial" w:hAnsi="Arial"/>
-              <w:color w:val="5A6578"/>
+              <w:color w:val="0A665D"/>
               <w:sz w:val="14"/>
             </w:rPr>
-            <w:t>مسح للموقع</w:t>
-            <w:br/>
             <w:t>thiqqah.live</w:t>
           </w:r>
         </w:p>
@@ -364,7 +219,6 @@
   <w:tbl>
     <w:tblPr>
       <w:tblW w:type="auto" w:w="0"/>
-      <w:tblLayout w:type="fixed"/>
       <w:tblLook w:firstColumn="1" w:firstRow="1" w:lastColumn="0" w:lastRow="0" w:noHBand="0" w:noVBand="1" w:val="04A0"/>
     </w:tblPr>
     <w:tblGrid>
@@ -375,7 +229,7 @@
         <w:tcPr>
           <w:tcW w:type="dxa" w:w="9638"/>
           <w:tcBorders>
-            <w:top w:val="single" w:sz="20" w:space="0" w:color="D4AF37"/>
+            <w:top w:val="single" w:sz="20" w:color="BD9144"/>
           </w:tcBorders>
         </w:tcPr>
         <w:p>
@@ -394,31 +248,43 @@
       <w:rPr>
         <w:rFonts w:ascii="Arial" w:hAnsi="Arial"/>
         <w:b/>
-        <w:color w:val="1A3352"/>
+        <w:color w:val="0A665D"/>
         <w:sz w:val="18"/>
       </w:rPr>
       <w:t>thiqqah.live</w:t>
     </w:r>
     <w:r>
+      <w:rPr>
+        <w:rFonts w:ascii="Arial" w:hAnsi="Arial"/>
+        <w:b w:val="0"/>
+        <w:color w:val="0A665D"/>
+        <w:sz w:val="18"/>
+      </w:rPr>
       <w:t xml:space="preserve">   ·   </w:t>
     </w:r>
     <w:r>
       <w:rPr>
         <w:rFonts w:ascii="Arial" w:hAnsi="Arial"/>
         <w:b/>
-        <w:color w:val="1A3352"/>
+        <w:color w:val="0A665D"/>
         <w:sz w:val="18"/>
       </w:rPr>
       <w:t>info@thiqqah.live</w:t>
     </w:r>
     <w:r>
+      <w:rPr>
+        <w:rFonts w:ascii="Arial" w:hAnsi="Arial"/>
+        <w:b w:val="0"/>
+        <w:color w:val="0A665D"/>
+        <w:sz w:val="18"/>
+      </w:rPr>
       <w:t xml:space="preserve">   ·   </w:t>
     </w:r>
     <w:r>
       <w:rPr>
         <w:rFonts w:ascii="Arial" w:hAnsi="Arial"/>
         <w:b/>
-        <w:color w:val="1A3352"/>
+        <w:color w:val="0A665D"/>
         <w:sz w:val="18"/>
       </w:rPr>
       <w:t>+966 56 756 6616</w:t>
@@ -437,26 +303,17 @@
   <w:tbl>
     <w:tblPr>
       <w:tblW w:type="auto" w:w="0"/>
-      <w:tblLayout w:type="fixed"/>
       <w:tblLook w:firstColumn="1" w:firstRow="1" w:lastColumn="0" w:lastRow="0" w:noHBand="0" w:noVBand="1" w:val="04A0"/>
     </w:tblPr>
     <w:tblGrid>
-      <w:gridCol w:w="7370"/>
-      <w:gridCol w:w="2268"/>
+      <w:gridCol w:w="5953"/>
+      <w:gridCol w:w="3685"/>
     </w:tblGrid>
     <w:tr>
       <w:tc>
         <w:tcPr>
           <w:tcW w:type="dxa" w:w="4819"/>
-        </w:tcPr>
-        <w:p>
-          <w:r/>
-        </w:p>
-      </w:tc>
-      <w:tc>
-        <w:tcPr>
-          <w:tcW w:type="dxa" w:w="4819"/>
-          <w:vAlign w:val="top"/>
+          <w:vAlign w:val="center"/>
         </w:tcPr>
         <w:p>
           <w:pPr>
@@ -465,9 +322,64 @@
             <w:bidi w:val="1"/>
           </w:pPr>
           <w:r>
+            <w:rPr>
+              <w:rFonts w:ascii="Arial" w:hAnsi="Arial"/>
+              <w:b/>
+              <w:color w:val="073F3A"/>
+              <w:sz w:val="32"/>
+            </w:rPr>
+            <w:t>مكتب ثقة الذهبية</w:t>
+            <w:br/>
+            <w:t>للخدمات العامة</w:t>
+          </w:r>
+        </w:p>
+        <w:p>
+          <w:pPr>
+            <w:spacing w:after="40"/>
+            <w:jc w:val="right"/>
+            <w:bidi w:val="1"/>
+          </w:pPr>
+          <w:r>
+            <w:rPr>
+              <w:rFonts w:ascii="Arial" w:hAnsi="Arial"/>
+              <w:b/>
+              <w:color w:val="12243A"/>
+              <w:sz w:val="20"/>
+            </w:rPr>
+            <w:t>السجل التجاري: 4030506321</w:t>
+          </w:r>
+        </w:p>
+        <w:p>
+          <w:pPr>
+            <w:spacing w:after="40"/>
+            <w:jc w:val="right"/>
+            <w:bidi w:val="1"/>
+          </w:pPr>
+          <w:r>
+            <w:rPr>
+              <w:rFonts w:ascii="Arial" w:hAnsi="Arial"/>
+              <w:color w:val="5F6D7F"/>
+              <w:sz w:val="17"/>
+            </w:rPr>
+            <w:t>جدة — منطقة مكة المكرمة — المملكة العربية السعودية</w:t>
+          </w:r>
+        </w:p>
+      </w:tc>
+      <w:tc>
+        <w:tcPr>
+          <w:tcW w:type="dxa" w:w="4819"/>
+          <w:vAlign w:val="center"/>
+        </w:tcPr>
+        <w:p>
+          <w:pPr>
+            <w:spacing w:after="0"/>
+            <w:jc w:val="right"/>
+            <w:bidi w:val="1"/>
+          </w:pPr>
+          <w:r>
             <w:drawing>
               <wp:inline xmlns:a="http://schemas.openxmlformats.org/drawingml/2006/main" xmlns:pic="http://schemas.openxmlformats.org/drawingml/2006/picture">
-                <wp:extent cx="522000" cy="369580"/>
+                <wp:extent cx="1314000" cy="930322"/>
                 <wp:docPr id="1" name="Picture 1"/>
                 <wp:cNvGraphicFramePr>
                   <a:graphicFrameLocks noChangeAspect="1"/>
@@ -488,7 +400,7 @@
                       <pic:spPr>
                         <a:xfrm>
                           <a:off x="0" y="0"/>
-                          <a:ext cx="522000" cy="369580"/>
+                          <a:ext cx="1314000" cy="930322"/>
                         </a:xfrm>
                         <a:prstGeom prst="rect"/>
                       </pic:spPr>
@@ -499,38 +411,29 @@
             </w:drawing>
           </w:r>
         </w:p>
-        <w:p>
-          <w:pPr>
-            <w:spacing w:after="60" w:before="0"/>
-            <w:jc w:val="right"/>
-            <w:bidi w:val="1"/>
-          </w:pPr>
-          <w:r>
-            <w:rPr>
-              <w:rFonts w:ascii="Arial" w:hAnsi="Arial"/>
-              <w:b/>
-              <w:color w:val="151F33"/>
-              <w:sz w:val="22"/>
-            </w:rPr>
-            <w:t>مكتب ثقة الذهبية</w:t>
-            <w:br/>
-            <w:t>للخدمات العامة</w:t>
-          </w:r>
-        </w:p>
+      </w:tc>
+    </w:tr>
+  </w:tbl>
+  <w:tbl>
+    <w:tblPr>
+      <w:tblW w:type="auto" w:w="0"/>
+      <w:tblLook w:firstColumn="1" w:firstRow="1" w:lastColumn="0" w:lastRow="0" w:noHBand="0" w:noVBand="1" w:val="04A0"/>
+    </w:tblPr>
+    <w:tblGrid>
+      <w:gridCol w:w="9638"/>
+    </w:tblGrid>
+    <w:tr>
+      <w:tc>
+        <w:tcPr>
+          <w:tcW w:type="dxa" w:w="9638"/>
+          <w:tcBorders>
+            <w:bottom w:val="single" w:sz="18" w:color="BD9144"/>
+          </w:tcBorders>
+        </w:tcPr>
         <w:p>
           <w:pPr>
             <w:spacing w:after="60"/>
-            <w:jc w:val="right"/>
-            <w:bidi w:val="1"/>
           </w:pPr>
-          <w:r>
-            <w:rPr>
-              <w:rFonts w:ascii="Arial" w:hAnsi="Arial"/>
-              <w:color w:val="5A6578"/>
-              <w:sz w:val="17"/>
-            </w:rPr>
-            <w:t>السجل التجاري: 4030506321</w:t>
-          </w:r>
         </w:p>
       </w:tc>
     </w:tr>

</xml_diff>